<commit_message>
Story-clusters draft: his 29 Sep answers applied; journey updated
His answers go into professional-journey.md as dated intake, with the three
disagreeing sources flagged (img.png 19.05 ms, the 14 Sep 70-80% note, the
case-study index on guardrails). The draft (variant:story-clusters) is edited
by a guarded, re-runnable SQL file; the master is untouched. .docx 35/35.

Co-Authored-By: Claude Opus 5.5 <noreply@anthropic.com>
</commit_message>
<xml_diff>
--- a/master/Abhisheik_Deo_Resume_story_clusters.docx
+++ b/master/Abhisheik_Deo_Resume_story_clusters.docx
@@ -71,7 +71,7 @@
         <w:pStyle w:val="Subtitle"/>
       </w:pPr>
       <w:r>
-        <w:t>Hands-on Principal Architect · 19+ yrs · Problem-first production AI: RAG, multi-agent, LLM · Java + Spring Boot (11 yrs) · Multi-tenant SaaS · AWS, Kubernetes, Terraform · Graph + GNN · HIPAA, ISO 27001 · AI-Leveraged Delivery (Claude Code + OpenAI Codex)</w:t>
+        <w:t>Hands-on Principal Architect · 19+ yrs · Problem-first production AI: RAG, multi-agent, LLM · Java + Spring Boot (11 yrs) · Multi-tenant SaaS · AWS (ECS Fargate), Terraform · Graph + GNN · HIPAA, ISO 27001 · AI-Leveraged Delivery (Claude Code + OpenAI Codex)</w:t>
       </w:r>
     </w:p>
     <w:p>
@@ -190,7 +190,7 @@
         <w:rPr>
           <w:b/>
         </w:rPr>
-        <w:t>Kubernetes and Terraform</w:t>
+        <w:t>Terraform and Amazon Elastic Container Service (ECS) Fargate</w:t>
       </w:r>
       <w:r>
         <w:t xml:space="preserve">, cutting infrastructure cost </w:t>
@@ -252,7 +252,7 @@
         <w:t>Decision-Intelligence Platforms</w:t>
       </w:r>
       <w:r>
-        <w:t xml:space="preserve"> (Event-Sourced + Graph + AI)</w:t>
+        <w:t xml:space="preserve"> (Event-Sourced + Graph + AI; Retrieval, Cohort Aggregation, Sequence Mining and Graph Traversal archetypes)</w:t>
       </w:r>
     </w:p>
     <w:p>
@@ -308,7 +308,7 @@
         <w:t>Multi-Tenant SaaS Architecture</w:t>
       </w:r>
       <w:r>
-        <w:t xml:space="preserve"> (Shared-Schema, Per-Tenant Isolation, Regulated Carve-Outs)</w:t>
+        <w:t xml:space="preserve"> (Shared-Schema, Per-Tenant Isolation, Regulated Carve-Outs, Shared or Dedicated Amazon Neptune per Tenant)</w:t>
       </w:r>
     </w:p>
     <w:p>
@@ -361,10 +361,10 @@
         <w:rPr>
           <w:b/>
         </w:rPr>
-        <w:t>Kubernetes, Terraform + Docker on AWS</w:t>
-      </w:r>
-      <w:r>
-        <w:t xml:space="preserve"> (company-wide standard, Elastic Container Service Fargate)</w:t>
+        <w:t>Terraform + Docker on AWS</w:t>
+      </w:r>
+      <w:r>
+        <w:t xml:space="preserve"> (company-wide standard, Elastic Container Service (ECS) Fargate)</w:t>
       </w:r>
     </w:p>
     <w:p>
@@ -420,7 +420,7 @@
         <w:t>Retrieval-Augmented Generation &amp; Vector Search</w:t>
       </w:r>
       <w:r>
-        <w:t xml:space="preserve"> (Elasticsearch dense_vector, Amazon SageMaker Embeddings)</w:t>
+        <w:t xml:space="preserve"> (Elasticsearch dense_vector, Amazon SageMaker Embeddings, warm-path P99 target under 200 ms)</w:t>
       </w:r>
     </w:p>
     <w:p>
@@ -854,13 +854,16 @@
         <w:pStyle w:val="ListBullet"/>
       </w:pPr>
       <w:r>
-        <w:t xml:space="preserve">Restricted large language models (LLMs) to narrating code-computed numbers — pinned model, temperature 0, chain hash, field-level claim grammar — designed to reject </w:t>
+        <w:t xml:space="preserve">Restricted large language models (LLMs) in production to narrating code-computed numbers — pinned model, </w:t>
       </w:r>
       <w:r>
         <w:rPr>
           <w:b/>
         </w:rPr>
-        <w:t>100% of uncited claims</w:t>
+        <w:t>temperature 0</w:t>
+      </w:r>
+      <w:r>
+        <w:t>, chain hash, field-level claim grammar rejecting uncited claims</w:t>
       </w:r>
     </w:p>
     <w:p>
@@ -996,21 +999,30 @@
         <w:t>Amazon Kinesis</w:t>
       </w:r>
       <w:r>
-        <w:t xml:space="preserve"> design with Enhanced Fan-Out, expanding 4 to 1,200 shards, as production headroom against spikes beyond the burst test</w:t>
-      </w:r>
-    </w:p>
-    <w:p>
-      <w:pPr>
-        <w:pStyle w:val="ListBullet"/>
-      </w:pPr>
-      <w:r>
-        <w:t xml:space="preserve">Reimagined the data layer across DynamoDB, PostgreSQL and OpenSearch with partition-key and indexing design holding </w:t>
+        <w:t xml:space="preserve"> design with Enhanced Fan-Out in on-demand mode, scaling from 4 to </w:t>
       </w:r>
       <w:r>
         <w:rPr>
           <w:b/>
         </w:rPr>
-        <w:t>P95 under 30 ms</w:t>
+        <w:t>~1,200 shards</w:t>
+      </w:r>
+      <w:r>
+        <w:t xml:space="preserve"> under load testing</w:t>
+      </w:r>
+    </w:p>
+    <w:p>
+      <w:pPr>
+        <w:pStyle w:val="ListBullet"/>
+      </w:pPr>
+      <w:r>
+        <w:t xml:space="preserve">Reimagined the data layer across DynamoDB, PostgreSQL and OpenSearch with partition-key and indexing design holding DynamoDB writes under </w:t>
+      </w:r>
+      <w:r>
+        <w:rPr>
+          <w:b/>
+        </w:rPr>
+        <w:t>16 ms P95</w:t>
       </w:r>
       <w:r>
         <w:t xml:space="preserve"> at 100,000-user load</w:t>
@@ -1064,7 +1076,7 @@
         <w:t>20-engineer team</w:t>
       </w:r>
       <w:r>
-        <w:t xml:space="preserve"> — daily design exploration, first-cut implementation and test scaffolding, all under hands-on review</w:t>
+        <w:t>, codifying repository standards in CLAUDE.md and AGENTS.md files to shorten onboarding</w:t>
       </w:r>
     </w:p>
     <w:p>
@@ -1072,7 +1084,16 @@
         <w:pStyle w:val="ListBullet"/>
       </w:pPr>
       <w:r>
-        <w:t xml:space="preserve">Provisioned Amazon Web Services on Kubernetes, Terraform and Elastic Container Service Fargate at 70% Spot — deploys </w:t>
+        <w:t xml:space="preserve">Provisioned Amazon Web Services on Terraform and Elastic Container Service Fargate at </w:t>
+      </w:r>
+      <w:r>
+        <w:rPr>
+          <w:b/>
+        </w:rPr>
+        <w:t>70% Spot</w:t>
+      </w:r>
+      <w:r>
+        <w:t xml:space="preserve"> — deploys </w:t>
       </w:r>
       <w:r>
         <w:rPr>
@@ -1202,7 +1223,7 @@
         <w:t>280 axe Monitor clients</w:t>
       </w:r>
       <w:r>
-        <w:t xml:space="preserve"> — Jira integration, API versioning, customer-specific frontends on one Spring Boot backend, backward compatibility</w:t>
+        <w:t xml:space="preserve"> — Jira integration, API versioning, backward compatibility — on one Spring Boot backend</w:t>
       </w:r>
     </w:p>
     <w:p>
@@ -1258,7 +1279,7 @@
         <w:pStyle w:val="ListBullet"/>
       </w:pPr>
       <w:r>
-        <w:t xml:space="preserve">Stewarded every axe Auditor instance from PostgreSQL 9.6, bundled in its Docker Compose stack, to Amazon Aurora PostgreSQL 13.x with </w:t>
+        <w:t xml:space="preserve">Stewarded every axe Auditor instance from PostgreSQL 9.6 to Amazon Relational Database Service (RDS) PostgreSQL 13.x, then onto Aurora, with </w:t>
       </w:r>
       <w:r>
         <w:rPr>
@@ -1281,7 +1302,7 @@
         <w:t>3–4 hours</w:t>
       </w:r>
       <w:r>
-        <w:t xml:space="preserve"> and deploy errors 40% by moving PostgreSQL onto Amazon Relational Database Service (RDS)</w:t>
+        <w:t xml:space="preserve"> and deploy errors 40% by moving PostgreSQL onto Amazon RDS</w:t>
       </w:r>
     </w:p>
     <w:p>
@@ -1289,7 +1310,7 @@
         <w:pStyle w:val="ListBullet"/>
       </w:pPr>
       <w:r>
-        <w:t xml:space="preserve">Modernised continuous integration and continuous delivery (CI/CD) from Jenkins to GitHub Actions, achieving ISO 27001 and </w:t>
+        <w:t xml:space="preserve">Modernised continuous integration and continuous delivery (CI/CD) from Jenkins, whose jobs stalled at scale, to GitHub Actions, achieving ISO 27001 and </w:t>
       </w:r>
       <w:r>
         <w:rPr>
@@ -1323,7 +1344,7 @@
         <w:pStyle w:val="ListBullet"/>
       </w:pPr>
       <w:r>
-        <w:t xml:space="preserve">Tackled accessibility teams' blind spot, unknown page counts and unannounced uniform resource locator (URL) changes, with spider discovery </w:t>
+        <w:t xml:space="preserve">Tackled accessibility teams' unknown page counts and unannounced changes to uniform resource locators (URLs) with spider discovery </w:t>
       </w:r>
       <w:r>
         <w:rPr>
@@ -1646,7 +1667,7 @@
         <w:rPr>
           <w:b/>
         </w:rPr>
-        <w:t>25 suppliers' rates</w:t>
+        <w:t>~30 suppliers' rates</w:t>
       </w:r>
       <w:r>
         <w:t xml:space="preserve"> in parallel, superseding .NET 2.0 code a prior team could not upgrade</w:t>
@@ -1688,7 +1709,7 @@
         <w:pStyle w:val="ListBullet"/>
       </w:pPr>
       <w:r>
-        <w:t xml:space="preserve">Traced hidden hotel inventory to clashing identifiers across 25 suppliers, where unmapped properties lacked images and ratings, and adopted licensed </w:t>
+        <w:t xml:space="preserve">Traced hidden hotel inventory to clashing identifiers across ~30 suppliers, where unmapped properties lacked images and ratings, and adopted licensed </w:t>
       </w:r>
       <w:r>
         <w:rPr>
@@ -1725,7 +1746,7 @@
         <w:t>65%</w:t>
       </w:r>
       <w:r>
-        <w:t xml:space="preserve"> by widening matched inventory and ranking direct-contract properties first across 2–3 million daily requests at peak</w:t>
+        <w:t xml:space="preserve"> by widening matched inventory, so each hotel's lowest supplier rate could be shown, at 2–3 million daily requests</w:t>
       </w:r>
     </w:p>
     <w:p>
@@ -2095,7 +2116,7 @@
         <w:pStyle w:val="ListBullet"/>
       </w:pPr>
       <w:r>
-        <w:t xml:space="preserve">Authored </w:t>
+        <w:t xml:space="preserve">Evolved </w:t>
       </w:r>
       <w:r>
         <w:rPr>
@@ -2104,7 +2125,7 @@
         <w:t>3 core modules</w:t>
       </w:r>
       <w:r>
-        <w:t xml:space="preserve"> — Nominations, Flowing Gas and Contracts — covering scheduling and contracting for interstate gas transport over 4 years</w:t>
+        <w:t xml:space="preserve"> — Nominations, Flowing Gas and Contracts — as requirements arrived, covering scheduling and contracting for interstate gas transport over 4 years</w:t>
       </w:r>
     </w:p>
     <w:p>

</xml_diff>